<commit_message>
Rebuilt the Word report with valid paragraph shading and tidier page breaks
</commit_message>
<xml_diff>
--- a/DSA521S_Group11_Project_Report.docx
+++ b/DSA521S_Group11_Project_Report.docx
@@ -1645,14 +1645,14 @@
     <w:p>
       <w:pPr>
         <w:keepLines/>
-        <w:spacing w:before="80" w:after="160" w:line="240" w:lineRule="auto"/>
-        <w:shd w:val="clear" w:fill="F5F4F1"/>
         <w:pBdr>
           <w:top w:val="single" w:sz="4" w:space="4" w:color="DCD9D2"/>
           <w:left w:val="single" w:sz="4" w:space="4" w:color="DCD9D2"/>
           <w:bottom w:val="single" w:sz="4" w:space="4" w:color="DCD9D2"/>
           <w:right w:val="single" w:sz="4" w:space="4" w:color="DCD9D2"/>
         </w:pBdr>
+        <w:shd w:val="clear" w:fill="F5F4F1"/>
+        <w:spacing w:before="80" w:after="160" w:line="240" w:lineRule="auto"/>
       </w:pPr>
       <w:r>
         <w:rPr>
@@ -1744,14 +1744,14 @@
     <w:p>
       <w:pPr>
         <w:keepLines/>
-        <w:spacing w:before="80" w:after="160" w:line="240" w:lineRule="auto"/>
-        <w:shd w:val="clear" w:fill="F5F4F1"/>
         <w:pBdr>
           <w:top w:val="single" w:sz="4" w:space="4" w:color="DCD9D2"/>
           <w:left w:val="single" w:sz="4" w:space="4" w:color="DCD9D2"/>
           <w:bottom w:val="single" w:sz="4" w:space="4" w:color="DCD9D2"/>
           <w:right w:val="single" w:sz="4" w:space="4" w:color="DCD9D2"/>
         </w:pBdr>
+        <w:shd w:val="clear" w:fill="F5F4F1"/>
+        <w:spacing w:before="80" w:after="160" w:line="240" w:lineRule="auto"/>
       </w:pPr>
       <w:r>
         <w:rPr>
@@ -1919,14 +1919,14 @@
     <w:p>
       <w:pPr>
         <w:keepLines/>
-        <w:spacing w:before="80" w:after="160" w:line="240" w:lineRule="auto"/>
-        <w:shd w:val="clear" w:fill="F5F4F1"/>
         <w:pBdr>
           <w:top w:val="single" w:sz="4" w:space="4" w:color="DCD9D2"/>
           <w:left w:val="single" w:sz="4" w:space="4" w:color="DCD9D2"/>
           <w:bottom w:val="single" w:sz="4" w:space="4" w:color="DCD9D2"/>
           <w:right w:val="single" w:sz="4" w:space="4" w:color="DCD9D2"/>
         </w:pBdr>
+        <w:shd w:val="clear" w:fill="F5F4F1"/>
+        <w:spacing w:before="80" w:after="160" w:line="240" w:lineRule="auto"/>
       </w:pPr>
       <w:r>
         <w:rPr>
@@ -2105,14 +2105,14 @@
     <w:p>
       <w:pPr>
         <w:keepLines/>
-        <w:spacing w:before="80" w:after="160" w:line="240" w:lineRule="auto"/>
-        <w:shd w:val="clear" w:fill="F5F4F1"/>
         <w:pBdr>
           <w:top w:val="single" w:sz="4" w:space="4" w:color="DCD9D2"/>
           <w:left w:val="single" w:sz="4" w:space="4" w:color="DCD9D2"/>
           <w:bottom w:val="single" w:sz="4" w:space="4" w:color="DCD9D2"/>
           <w:right w:val="single" w:sz="4" w:space="4" w:color="DCD9D2"/>
         </w:pBdr>
+        <w:shd w:val="clear" w:fill="F5F4F1"/>
+        <w:spacing w:before="80" w:after="160" w:line="240" w:lineRule="auto"/>
       </w:pPr>
       <w:r>
         <w:rPr>
@@ -5436,14 +5436,14 @@
     <w:p>
       <w:pPr>
         <w:keepLines/>
-        <w:spacing w:before="80" w:after="160" w:line="240" w:lineRule="auto"/>
-        <w:shd w:val="clear" w:fill="F5F4F1"/>
         <w:pBdr>
           <w:top w:val="single" w:sz="4" w:space="4" w:color="DCD9D2"/>
           <w:left w:val="single" w:sz="4" w:space="4" w:color="DCD9D2"/>
           <w:bottom w:val="single" w:sz="4" w:space="4" w:color="DCD9D2"/>
           <w:right w:val="single" w:sz="4" w:space="4" w:color="DCD9D2"/>
         </w:pBdr>
+        <w:shd w:val="clear" w:fill="F5F4F1"/>
+        <w:spacing w:before="80" w:after="160" w:line="240" w:lineRule="auto"/>
       </w:pPr>
       <w:r>
         <w:rPr>
@@ -8999,14 +8999,14 @@
     <w:p>
       <w:pPr>
         <w:keepLines/>
-        <w:spacing w:before="80" w:after="160" w:line="240" w:lineRule="auto"/>
-        <w:shd w:val="clear" w:fill="F5F4F1"/>
         <w:pBdr>
           <w:top w:val="single" w:sz="4" w:space="4" w:color="DCD9D2"/>
           <w:left w:val="single" w:sz="4" w:space="4" w:color="DCD9D2"/>
           <w:bottom w:val="single" w:sz="4" w:space="4" w:color="DCD9D2"/>
           <w:right w:val="single" w:sz="4" w:space="4" w:color="DCD9D2"/>
         </w:pBdr>
+        <w:shd w:val="clear" w:fill="F5F4F1"/>
+        <w:spacing w:before="80" w:after="160" w:line="240" w:lineRule="auto"/>
       </w:pPr>
       <w:r>
         <w:rPr>
@@ -9099,14 +9099,14 @@
     <w:p>
       <w:pPr>
         <w:keepLines/>
-        <w:spacing w:before="80" w:after="160" w:line="240" w:lineRule="auto"/>
-        <w:shd w:val="clear" w:fill="F5F4F1"/>
         <w:pBdr>
           <w:top w:val="single" w:sz="4" w:space="4" w:color="DCD9D2"/>
           <w:left w:val="single" w:sz="4" w:space="4" w:color="DCD9D2"/>
           <w:bottom w:val="single" w:sz="4" w:space="4" w:color="DCD9D2"/>
           <w:right w:val="single" w:sz="4" w:space="4" w:color="DCD9D2"/>
         </w:pBdr>
+        <w:shd w:val="clear" w:fill="F5F4F1"/>
+        <w:spacing w:before="80" w:after="160" w:line="240" w:lineRule="auto"/>
       </w:pPr>
       <w:r>
         <w:rPr>
@@ -9191,14 +9191,14 @@
     <w:p>
       <w:pPr>
         <w:keepLines/>
-        <w:spacing w:before="80" w:after="160" w:line="240" w:lineRule="auto"/>
-        <w:shd w:val="clear" w:fill="F5F4F1"/>
         <w:pBdr>
           <w:top w:val="single" w:sz="4" w:space="4" w:color="DCD9D2"/>
           <w:left w:val="single" w:sz="4" w:space="4" w:color="DCD9D2"/>
           <w:bottom w:val="single" w:sz="4" w:space="4" w:color="DCD9D2"/>
           <w:right w:val="single" w:sz="4" w:space="4" w:color="DCD9D2"/>
         </w:pBdr>
+        <w:shd w:val="clear" w:fill="F5F4F1"/>
+        <w:spacing w:before="80" w:after="160" w:line="240" w:lineRule="auto"/>
       </w:pPr>
       <w:r>
         <w:rPr>
@@ -9361,14 +9361,14 @@
     <w:p>
       <w:pPr>
         <w:keepLines/>
-        <w:spacing w:before="80" w:after="160" w:line="240" w:lineRule="auto"/>
-        <w:shd w:val="clear" w:fill="F5F4F1"/>
         <w:pBdr>
           <w:top w:val="single" w:sz="4" w:space="4" w:color="DCD9D2"/>
           <w:left w:val="single" w:sz="4" w:space="4" w:color="DCD9D2"/>
           <w:bottom w:val="single" w:sz="4" w:space="4" w:color="DCD9D2"/>
           <w:right w:val="single" w:sz="4" w:space="4" w:color="DCD9D2"/>
         </w:pBdr>
+        <w:shd w:val="clear" w:fill="F5F4F1"/>
+        <w:spacing w:before="80" w:after="160" w:line="240" w:lineRule="auto"/>
       </w:pPr>
       <w:r>
         <w:rPr>
@@ -9525,14 +9525,14 @@
     <w:p>
       <w:pPr>
         <w:keepLines/>
-        <w:spacing w:before="80" w:after="160" w:line="240" w:lineRule="auto"/>
-        <w:shd w:val="clear" w:fill="F5F4F1"/>
         <w:pBdr>
           <w:top w:val="single" w:sz="4" w:space="4" w:color="DCD9D2"/>
           <w:left w:val="single" w:sz="4" w:space="4" w:color="DCD9D2"/>
           <w:bottom w:val="single" w:sz="4" w:space="4" w:color="DCD9D2"/>
           <w:right w:val="single" w:sz="4" w:space="4" w:color="DCD9D2"/>
         </w:pBdr>
+        <w:shd w:val="clear" w:fill="F5F4F1"/>
+        <w:spacing w:before="80" w:after="160" w:line="240" w:lineRule="auto"/>
       </w:pPr>
       <w:r>
         <w:rPr>
@@ -9767,14 +9767,14 @@
     <w:p>
       <w:pPr>
         <w:keepLines/>
-        <w:spacing w:before="80" w:after="160" w:line="240" w:lineRule="auto"/>
-        <w:shd w:val="clear" w:fill="F5F4F1"/>
         <w:pBdr>
           <w:top w:val="single" w:sz="4" w:space="4" w:color="DCD9D2"/>
           <w:left w:val="single" w:sz="4" w:space="4" w:color="DCD9D2"/>
           <w:bottom w:val="single" w:sz="4" w:space="4" w:color="DCD9D2"/>
           <w:right w:val="single" w:sz="4" w:space="4" w:color="DCD9D2"/>
         </w:pBdr>
+        <w:shd w:val="clear" w:fill="F5F4F1"/>
+        <w:spacing w:before="80" w:after="160" w:line="240" w:lineRule="auto"/>
       </w:pPr>
       <w:r>
         <w:rPr>
@@ -9907,14 +9907,14 @@
     <w:p>
       <w:pPr>
         <w:keepLines/>
-        <w:spacing w:before="80" w:after="160" w:line="240" w:lineRule="auto"/>
-        <w:shd w:val="clear" w:fill="F5F4F1"/>
         <w:pBdr>
           <w:top w:val="single" w:sz="4" w:space="4" w:color="DCD9D2"/>
           <w:left w:val="single" w:sz="4" w:space="4" w:color="DCD9D2"/>
           <w:bottom w:val="single" w:sz="4" w:space="4" w:color="DCD9D2"/>
           <w:right w:val="single" w:sz="4" w:space="4" w:color="DCD9D2"/>
         </w:pBdr>
+        <w:shd w:val="clear" w:fill="F5F4F1"/>
+        <w:spacing w:before="80" w:after="160" w:line="240" w:lineRule="auto"/>
       </w:pPr>
       <w:r>
         <w:rPr>
@@ -10078,14 +10078,14 @@
     <w:p>
       <w:pPr>
         <w:keepLines/>
-        <w:spacing w:before="80" w:after="160" w:line="240" w:lineRule="auto"/>
-        <w:shd w:val="clear" w:fill="F5F4F1"/>
         <w:pBdr>
           <w:top w:val="single" w:sz="4" w:space="4" w:color="DCD9D2"/>
           <w:left w:val="single" w:sz="4" w:space="4" w:color="DCD9D2"/>
           <w:bottom w:val="single" w:sz="4" w:space="4" w:color="DCD9D2"/>
           <w:right w:val="single" w:sz="4" w:space="4" w:color="DCD9D2"/>
         </w:pBdr>
+        <w:shd w:val="clear" w:fill="F5F4F1"/>
+        <w:spacing w:before="80" w:after="160" w:line="240" w:lineRule="auto"/>
       </w:pPr>
       <w:r>
         <w:rPr>
@@ -10210,14 +10210,14 @@
     <w:p>
       <w:pPr>
         <w:keepLines/>
-        <w:spacing w:before="80" w:after="160" w:line="240" w:lineRule="auto"/>
-        <w:shd w:val="clear" w:fill="F5F4F1"/>
         <w:pBdr>
           <w:top w:val="single" w:sz="4" w:space="4" w:color="DCD9D2"/>
           <w:left w:val="single" w:sz="4" w:space="4" w:color="DCD9D2"/>
           <w:bottom w:val="single" w:sz="4" w:space="4" w:color="DCD9D2"/>
           <w:right w:val="single" w:sz="4" w:space="4" w:color="DCD9D2"/>
         </w:pBdr>
+        <w:shd w:val="clear" w:fill="F5F4F1"/>
+        <w:spacing w:before="80" w:after="160" w:line="240" w:lineRule="auto"/>
       </w:pPr>
       <w:r>
         <w:rPr>
@@ -10326,14 +10326,14 @@
     <w:p>
       <w:pPr>
         <w:keepLines/>
-        <w:spacing w:before="80" w:after="160" w:line="240" w:lineRule="auto"/>
-        <w:shd w:val="clear" w:fill="F5F4F1"/>
         <w:pBdr>
           <w:top w:val="single" w:sz="4" w:space="4" w:color="DCD9D2"/>
           <w:left w:val="single" w:sz="4" w:space="4" w:color="DCD9D2"/>
           <w:bottom w:val="single" w:sz="4" w:space="4" w:color="DCD9D2"/>
           <w:right w:val="single" w:sz="4" w:space="4" w:color="DCD9D2"/>
         </w:pBdr>
+        <w:shd w:val="clear" w:fill="F5F4F1"/>
+        <w:spacing w:before="80" w:after="160" w:line="240" w:lineRule="auto"/>
       </w:pPr>
       <w:r>
         <w:rPr>
@@ -10466,14 +10466,14 @@
     <w:p>
       <w:pPr>
         <w:keepLines/>
-        <w:spacing w:before="80" w:after="160" w:line="240" w:lineRule="auto"/>
-        <w:shd w:val="clear" w:fill="F5F4F1"/>
         <w:pBdr>
           <w:top w:val="single" w:sz="4" w:space="4" w:color="DCD9D2"/>
           <w:left w:val="single" w:sz="4" w:space="4" w:color="DCD9D2"/>
           <w:bottom w:val="single" w:sz="4" w:space="4" w:color="DCD9D2"/>
           <w:right w:val="single" w:sz="4" w:space="4" w:color="DCD9D2"/>
         </w:pBdr>
+        <w:shd w:val="clear" w:fill="F5F4F1"/>
+        <w:spacing w:before="80" w:after="160" w:line="240" w:lineRule="auto"/>
       </w:pPr>
       <w:r>
         <w:rPr>
@@ -10653,14 +10653,14 @@
     <w:p>
       <w:pPr>
         <w:keepLines/>
-        <w:spacing w:before="80" w:after="160" w:line="240" w:lineRule="auto"/>
-        <w:shd w:val="clear" w:fill="F5F4F1"/>
         <w:pBdr>
           <w:top w:val="single" w:sz="4" w:space="4" w:color="DCD9D2"/>
           <w:left w:val="single" w:sz="4" w:space="4" w:color="DCD9D2"/>
           <w:bottom w:val="single" w:sz="4" w:space="4" w:color="DCD9D2"/>
           <w:right w:val="single" w:sz="4" w:space="4" w:color="DCD9D2"/>
         </w:pBdr>
+        <w:shd w:val="clear" w:fill="F5F4F1"/>
+        <w:spacing w:before="80" w:after="160" w:line="240" w:lineRule="auto"/>
       </w:pPr>
       <w:r>
         <w:rPr>

</xml_diff>